<commit_message>
docs(walkthrough): flag total_customers as undefined design gap in γ distribution fairness component
</commit_message>
<xml_diff>
--- a/Reference-Material/reference/acrme_calculation_logic_comprehensive_walkthrough.docx
+++ b/Reference-Material/reference/acrme_calculation_logic_comprehensive_walkthrough.docx
@@ -2,7 +2,7 @@
 <file path=word/document.xml><?xml version="1.0" encoding="utf-8"?>
 <w:document xmlns:w="http://schemas.openxmlformats.org/wordprocessingml/2006/main" xmlns:m="http://schemas.openxmlformats.org/officeDocument/2006/math" xmlns:r="http://schemas.openxmlformats.org/officeDocument/2006/relationships" xmlns:o="urn:schemas-microsoft-com:office:office" xmlns:v="urn:schemas-microsoft-com:vml" xmlns:w10="urn:schemas-microsoft-com:office:word" xmlns:a="http://schemas.openxmlformats.org/drawingml/2006/main" xmlns:pic="http://schemas.openxmlformats.org/drawingml/2006/picture" xmlns:wp="http://schemas.openxmlformats.org/drawingml/2006/wordprocessingDrawing">
   <w:body>
-    <w:bookmarkStart w:id="78" w:name="X54ce0335c1485f2d9015d8ae4f15985f9316732"/>
+    <w:bookmarkStart w:id="83" w:name="X54ce0335c1485f2d9015d8ae4f15985f9316732"/>
     <w:p>
       <w:pPr>
         <w:pStyle w:val="Heading1"/>
@@ -730,7 +730,7 @@
               <w:jc w:val="left"/>
             </w:pPr>
             <w:r>
-              <w:t xml:space="preserve">8 of 20</w:t>
+              <w:t xml:space="preserve">8 of 20 ⚠️</w:t>
             </w:r>
           </w:p>
         </w:tc>
@@ -828,7 +828,7 @@
               <w:jc w:val="left"/>
             </w:pPr>
             <w:r>
-              <w:t xml:space="preserve">12 of 20</w:t>
+              <w:t xml:space="preserve">12 of 20 ⚠️</w:t>
             </w:r>
           </w:p>
         </w:tc>
@@ -926,7 +926,7 @@
               <w:jc w:val="left"/>
             </w:pPr>
             <w:r>
-              <w:t xml:space="preserve">5 of 20</w:t>
+              <w:t xml:space="preserve">5 of 20 ⚠️</w:t>
             </w:r>
           </w:p>
         </w:tc>
@@ -946,7 +946,105 @@
     </w:tbl>
     <w:p>
       <w:pPr>
-        <w:pStyle w:val="BodyText"/>
+        <w:pStyle w:val="BlockText"/>
+      </w:pPr>
+      <w:r>
+        <w:t xml:space="preserve">⚠️</w:t>
+      </w:r>
+      <w:r>
+        <w:t xml:space="preserve"> </w:t>
+      </w:r>
+      <w:r>
+        <w:rPr>
+          <w:bCs/>
+          <w:b/>
+        </w:rPr>
+        <w:t xml:space="preserve">“</w:t>
+      </w:r>
+      <w:r>
+        <w:rPr>
+          <w:bCs/>
+          <w:b/>
+        </w:rPr>
+        <w:t xml:space="preserve">of 20</w:t>
+      </w:r>
+      <w:r>
+        <w:rPr>
+          <w:bCs/>
+          <w:b/>
+        </w:rPr>
+        <w:t xml:space="preserve">”</w:t>
+      </w:r>
+      <w:r>
+        <w:t xml:space="preserve"> </w:t>
+      </w:r>
+      <w:r>
+        <w:t xml:space="preserve">— this</w:t>
+      </w:r>
+      <w:r>
+        <w:t xml:space="preserve"> </w:t>
+      </w:r>
+      <w:r>
+        <w:rPr>
+          <w:rStyle w:val="VerbatimChar"/>
+        </w:rPr>
+        <w:t xml:space="preserve">total_customers</w:t>
+      </w:r>
+      <w:r>
+        <w:t xml:space="preserve"> </w:t>
+      </w:r>
+      <w:r>
+        <w:t xml:space="preserve">denominator is an</w:t>
+      </w:r>
+      <w:r>
+        <w:t xml:space="preserve"> </w:t>
+      </w:r>
+      <w:r>
+        <w:rPr>
+          <w:bCs/>
+          <w:b/>
+        </w:rPr>
+        <w:t xml:space="preserve">undefined term</w:t>
+      </w:r>
+      <w:r>
+        <w:t xml:space="preserve"> </w:t>
+      </w:r>
+      <w:r>
+        <w:t xml:space="preserve">in the baseline. See the</w:t>
+      </w:r>
+      <w:r>
+        <w:t xml:space="preserve"> </w:t>
+      </w:r>
+      <w:hyperlink w:anchor="X0ba1e2f91384d73d405ca2c6cc185d69b5121a4">
+        <w:r>
+          <w:rPr>
+            <w:rStyle w:val="Hyperlink"/>
+          </w:rPr>
+          <w:t xml:space="preserve">Open Issue on</w:t>
+        </w:r>
+        <w:r>
+          <w:rPr>
+            <w:rStyle w:val="Hyperlink"/>
+          </w:rPr>
+          <w:t xml:space="preserve"> </w:t>
+        </w:r>
+        <w:r>
+          <w:rPr>
+            <w:rStyle w:val="VerbatimChar"/>
+          </w:rPr>
+          <w:t xml:space="preserve">total_customers</w:t>
+        </w:r>
+      </w:hyperlink>
+      <w:r>
+        <w:t xml:space="preserve"> </w:t>
+      </w:r>
+      <w:r>
+        <w:t xml:space="preserve">above. The value 20 is used here for illustrative arithmetic only.</w:t>
+      </w:r>
+    </w:p>
+    <w:p>
+      <w:pPr>
+        <w:pStyle w:val="FirstParagraph"/>
       </w:pPr>
       <w:r>
         <w:rPr>
@@ -1154,7 +1252,7 @@
               <w:jc w:val="left"/>
             </w:pPr>
             <w:r>
-              <w:t xml:space="preserve">6 of 15</w:t>
+              <w:t xml:space="preserve">6 of 15 ⚠️</w:t>
             </w:r>
           </w:p>
         </w:tc>
@@ -1252,7 +1350,7 @@
               <w:jc w:val="left"/>
             </w:pPr>
             <w:r>
-              <w:t xml:space="preserve">4 of 15</w:t>
+              <w:t xml:space="preserve">4 of 15 ⚠️</w:t>
             </w:r>
           </w:p>
         </w:tc>
@@ -1272,7 +1370,77 @@
     </w:tbl>
     <w:p>
       <w:pPr>
-        <w:pStyle w:val="BodyText"/>
+        <w:pStyle w:val="BlockText"/>
+      </w:pPr>
+      <w:r>
+        <w:t xml:space="preserve">⚠️</w:t>
+      </w:r>
+      <w:r>
+        <w:t xml:space="preserve"> </w:t>
+      </w:r>
+      <w:r>
+        <w:rPr>
+          <w:bCs/>
+          <w:b/>
+        </w:rPr>
+        <w:t xml:space="preserve">“</w:t>
+      </w:r>
+      <w:r>
+        <w:rPr>
+          <w:bCs/>
+          <w:b/>
+        </w:rPr>
+        <w:t xml:space="preserve">of 15</w:t>
+      </w:r>
+      <w:r>
+        <w:rPr>
+          <w:bCs/>
+          <w:b/>
+        </w:rPr>
+        <w:t xml:space="preserve">”</w:t>
+      </w:r>
+      <w:r>
+        <w:t xml:space="preserve"> </w:t>
+      </w:r>
+      <w:r>
+        <w:t xml:space="preserve">— same undefined</w:t>
+      </w:r>
+      <w:r>
+        <w:t xml:space="preserve"> </w:t>
+      </w:r>
+      <w:r>
+        <w:rPr>
+          <w:rStyle w:val="VerbatimChar"/>
+        </w:rPr>
+        <w:t xml:space="preserve">total_customers</w:t>
+      </w:r>
+      <w:r>
+        <w:t xml:space="preserve"> </w:t>
+      </w:r>
+      <w:r>
+        <w:t xml:space="preserve">term. See the</w:t>
+      </w:r>
+      <w:r>
+        <w:t xml:space="preserve"> </w:t>
+      </w:r>
+      <w:hyperlink w:anchor="X0ba1e2f91384d73d405ca2c6cc185d69b5121a4">
+        <w:r>
+          <w:rPr>
+            <w:rStyle w:val="Hyperlink"/>
+          </w:rPr>
+          <w:t xml:space="preserve">Open Issue</w:t>
+        </w:r>
+      </w:hyperlink>
+      <w:r>
+        <w:t xml:space="preserve"> </w:t>
+      </w:r>
+      <w:r>
+        <w:t xml:space="preserve">above.</w:t>
+      </w:r>
+    </w:p>
+    <w:p>
+      <w:pPr>
+        <w:pStyle w:val="FirstParagraph"/>
       </w:pPr>
       <w:r>
         <w:rPr>
@@ -1357,7 +1525,7 @@
     </w:p>
     <w:bookmarkEnd w:id="22"/>
     <w:bookmarkEnd w:id="23"/>
-    <w:bookmarkStart w:id="26" w:name="part-1-region-selection"/>
+    <w:bookmarkStart w:id="31" w:name="part-1-region-selection"/>
     <w:p>
       <w:pPr>
         <w:pStyle w:val="Heading2"/>
@@ -1665,8 +1833,979 @@
       </w:r>
     </w:p>
     <w:bookmarkEnd w:id="25"/>
+    <w:bookmarkStart w:id="30" w:name="Xf1bb57574a39851c5acb43461db9727a514b9cf"/>
+    <w:p>
+      <w:pPr>
+        <w:pStyle w:val="Heading3"/>
+      </w:pPr>
+      <w:r>
+        <w:t xml:space="preserve">⚠️ OPEN ISSUE —</w:t>
+      </w:r>
+      <w:r>
+        <w:t xml:space="preserve"> </w:t>
+      </w:r>
+      <w:r>
+        <w:rPr>
+          <w:rStyle w:val="VerbatimChar"/>
+        </w:rPr>
+        <w:t xml:space="preserve">total_customers</w:t>
+      </w:r>
+      <w:r>
+        <w:t xml:space="preserve"> </w:t>
+      </w:r>
+      <w:r>
+        <w:t xml:space="preserve">in the γ (Distribution Fairness) Component</w:t>
+      </w:r>
+    </w:p>
+    <w:p>
+      <w:pPr>
+        <w:pStyle w:val="FirstParagraph"/>
+      </w:pPr>
+      <w:r>
+        <w:t xml:space="preserve">The distribution fairness component γ appears in all three scoring formulas (PS_Prod, PS_NonProd, PS_DR) as:</w:t>
+      </w:r>
+    </w:p>
+    <w:p>
+      <w:pPr>
+        <w:pStyle w:val="SourceCode"/>
+      </w:pPr>
+      <w:r>
+        <w:rPr>
+          <w:rStyle w:val="VerbatimChar"/>
+        </w:rPr>
+        <w:t xml:space="preserve">γ_component = 1 - (region_customer_count / total_customers)</w:t>
+      </w:r>
+    </w:p>
+    <w:p>
+      <w:pPr>
+        <w:pStyle w:val="FirstParagraph"/>
+      </w:pPr>
+      <w:r>
+        <w:t xml:space="preserve">For example, in the US snapshot below, the γ calculation for Central US shows</w:t>
+      </w:r>
+      <w:r>
+        <w:t xml:space="preserve"> </w:t>
+      </w:r>
+      <w:r>
+        <w:rPr>
+          <w:rStyle w:val="VerbatimChar"/>
+        </w:rPr>
+        <w:t xml:space="preserve">1 - (12/20) = 0.40</w:t>
+      </w:r>
+      <w:r>
+        <w:t xml:space="preserve">, where</w:t>
+      </w:r>
+      <w:r>
+        <w:t xml:space="preserve"> </w:t>
+      </w:r>
+      <w:r>
+        <w:rPr>
+          <w:bCs/>
+          <w:b/>
+        </w:rPr>
+        <w:t xml:space="preserve">12</w:t>
+      </w:r>
+      <w:r>
+        <w:t xml:space="preserve"> </w:t>
+      </w:r>
+      <w:r>
+        <w:t xml:space="preserve">is the number of customers already placed in Central US and</w:t>
+      </w:r>
+      <w:r>
+        <w:t xml:space="preserve"> </w:t>
+      </w:r>
+      <w:r>
+        <w:rPr>
+          <w:bCs/>
+          <w:b/>
+        </w:rPr>
+        <w:t xml:space="preserve">20</w:t>
+      </w:r>
+      <w:r>
+        <w:t xml:space="preserve"> </w:t>
+      </w:r>
+      <w:r>
+        <w:t xml:space="preserve">is</w:t>
+      </w:r>
+      <w:r>
+        <w:t xml:space="preserve"> </w:t>
+      </w:r>
+      <w:r>
+        <w:rPr>
+          <w:rStyle w:val="VerbatimChar"/>
+        </w:rPr>
+        <w:t xml:space="preserve">total_customers</w:t>
+      </w:r>
+      <w:r>
+        <w:t xml:space="preserve">.</w:t>
+      </w:r>
+    </w:p>
+    <w:bookmarkStart w:id="26" w:name="what-is-total_customers"/>
+    <w:p>
+      <w:pPr>
+        <w:pStyle w:val="Heading4"/>
+      </w:pPr>
+      <w:r>
+        <w:t xml:space="preserve">What is</w:t>
+      </w:r>
+      <w:r>
+        <w:t xml:space="preserve"> </w:t>
+      </w:r>
+      <w:r>
+        <w:rPr>
+          <w:rStyle w:val="VerbatimChar"/>
+        </w:rPr>
+        <w:t xml:space="preserve">total_customers</w:t>
+      </w:r>
+      <w:r>
+        <w:t xml:space="preserve">?</w:t>
+      </w:r>
+    </w:p>
+    <w:p>
+      <w:pPr>
+        <w:pStyle w:val="FirstParagraph"/>
+      </w:pPr>
+      <w:r>
+        <w:rPr>
+          <w:bCs/>
+          <w:b/>
+        </w:rPr>
+        <w:t xml:space="preserve">It is undefined.</w:t>
+      </w:r>
+      <w:r>
+        <w:t xml:space="preserve"> </w:t>
+      </w:r>
+      <w:r>
+        <w:t xml:space="preserve">The Requirements Baseline v2.4 does not define this term — not in the Terminology (Section 4), not in Appendix A (Core Formulas), not in the Configurable Items Register (Section 22), and not in the Placement requirements (Section 11). The Calculation Logic Reference uses it in the PS_Prod, PS_NonProd, and PS_DR formulas (marked</w:t>
+      </w:r>
+      <w:r>
+        <w:t xml:space="preserve"> </w:t>
+      </w:r>
+      <w:r>
+        <w:rPr>
+          <w:rStyle w:val="VerbatimChar"/>
+        </w:rPr>
+        <w:t xml:space="preserve">[Decided]</w:t>
+      </w:r>
+      <w:r>
+        <w:t xml:space="preserve">) but never specifies its source, scope, or refresh mechanism.</w:t>
+      </w:r>
+    </w:p>
     <w:bookmarkEnd w:id="26"/>
-    <w:bookmarkStart w:id="40" w:name="X9dc3f2ea4bc0f2077944752d1f814fb25d7f86c"/>
+    <w:bookmarkStart w:id="27" w:name="why-does-this-matter"/>
+    <w:p>
+      <w:pPr>
+        <w:pStyle w:val="Heading4"/>
+      </w:pPr>
+      <w:r>
+        <w:t xml:space="preserve">Why does this matter?</w:t>
+      </w:r>
+    </w:p>
+    <w:p>
+      <w:pPr>
+        <w:pStyle w:val="FirstParagraph"/>
+      </w:pPr>
+      <w:r>
+        <w:t xml:space="preserve">The value of</w:t>
+      </w:r>
+      <w:r>
+        <w:t xml:space="preserve"> </w:t>
+      </w:r>
+      <w:r>
+        <w:rPr>
+          <w:rStyle w:val="VerbatimChar"/>
+        </w:rPr>
+        <w:t xml:space="preserve">total_customers</w:t>
+      </w:r>
+      <w:r>
+        <w:t xml:space="preserve"> </w:t>
+      </w:r>
+      <w:r>
+        <w:t xml:space="preserve">fundamentally changes what γ measures and how it behaves:</w:t>
+      </w:r>
+    </w:p>
+    <w:tbl>
+      <w:tblPr>
+        <w:tblStyle w:val="Table"/>
+        <w:tblW w:type="pct" w:w="5000"/>
+        <w:tblLook w:firstRow="1" w:lastRow="0" w:firstColumn="0" w:lastColumn="0" w:noHBand="0" w:noVBand="0" w:val="0020"/>
+      </w:tblPr>
+      <w:tblGrid>
+        <w:gridCol w:w="2640"/>
+        <w:gridCol w:w="2640"/>
+        <w:gridCol w:w="2640"/>
+      </w:tblGrid>
+      <w:tr>
+        <w:trPr>
+          <w:tblHeader w:val="true"/>
+        </w:trPr>
+        <w:tc>
+          <w:tcPr/>
+          <w:p>
+            <w:pPr>
+              <w:pStyle w:val="Compact"/>
+              <w:jc w:val="left"/>
+            </w:pPr>
+            <w:r>
+              <w:t xml:space="preserve">If</w:t>
+            </w:r>
+            <w:r>
+              <w:t xml:space="preserve"> </w:t>
+            </w:r>
+            <w:r>
+              <w:rPr>
+                <w:rStyle w:val="VerbatimChar"/>
+              </w:rPr>
+              <w:t xml:space="preserve">total_customers</w:t>
+            </w:r>
+            <w:r>
+              <w:t xml:space="preserve"> </w:t>
+            </w:r>
+            <w:r>
+              <w:t xml:space="preserve">means…</w:t>
+            </w:r>
+          </w:p>
+        </w:tc>
+        <w:tc>
+          <w:tcPr/>
+          <w:p>
+            <w:pPr>
+              <w:pStyle w:val="Compact"/>
+              <w:jc w:val="left"/>
+            </w:pPr>
+            <w:r>
+              <w:t xml:space="preserve">γ behaviour</w:t>
+            </w:r>
+          </w:p>
+        </w:tc>
+        <w:tc>
+          <w:tcPr/>
+          <w:p>
+            <w:pPr>
+              <w:pStyle w:val="Compact"/>
+              <w:jc w:val="left"/>
+            </w:pPr>
+            <w:r>
+              <w:t xml:space="preserve">Problem</w:t>
+            </w:r>
+          </w:p>
+        </w:tc>
+      </w:tr>
+      <w:tr>
+        <w:tc>
+          <w:tcPr/>
+          <w:p>
+            <w:pPr>
+              <w:pStyle w:val="Compact"/>
+              <w:jc w:val="left"/>
+            </w:pPr>
+            <w:r>
+              <w:rPr>
+                <w:bCs/>
+                <w:b/>
+              </w:rPr>
+              <w:t xml:space="preserve">All customers with a seed record</w:t>
+            </w:r>
+            <w:r>
+              <w:t xml:space="preserve"> </w:t>
+            </w:r>
+            <w:r>
+              <w:t xml:space="preserve">(actual, current count across ALL regions in the geography)</w:t>
+            </w:r>
+          </w:p>
+        </w:tc>
+        <w:tc>
+          <w:tcPr/>
+          <w:p>
+            <w:pPr>
+              <w:pStyle w:val="Compact"/>
+              <w:jc w:val="left"/>
+            </w:pPr>
+            <w:r>
+              <w:t xml:space="preserve">γ measures the</w:t>
+            </w:r>
+            <w:r>
+              <w:t xml:space="preserve"> </w:t>
+            </w:r>
+            <w:r>
+              <w:rPr>
+                <w:bCs/>
+                <w:b/>
+              </w:rPr>
+              <w:t xml:space="preserve">share of existing customers</w:t>
+            </w:r>
+            <w:r>
+              <w:t xml:space="preserve"> </w:t>
+            </w:r>
+            <w:r>
+              <w:t xml:space="preserve">in this region vs the total estate. It changes with every new placement.</w:t>
+            </w:r>
+          </w:p>
+        </w:tc>
+        <w:tc>
+          <w:tcPr/>
+          <w:p>
+            <w:pPr>
+              <w:pStyle w:val="Compact"/>
+              <w:jc w:val="left"/>
+            </w:pPr>
+            <w:r>
+              <w:t xml:space="preserve">This is a</w:t>
+            </w:r>
+            <w:r>
+              <w:t xml:space="preserve"> </w:t>
+            </w:r>
+            <w:r>
+              <w:rPr>
+                <w:bCs/>
+                <w:b/>
+              </w:rPr>
+              <w:t xml:space="preserve">relative share</w:t>
+            </w:r>
+            <w:r>
+              <w:t xml:space="preserve"> </w:t>
+            </w:r>
+            <w:r>
+              <w:t xml:space="preserve">signal — it gets weaker as the estate grows (at 1000 customers, adding 1 to a region barely moves γ). Works for fairness but becomes</w:t>
+            </w:r>
+            <w:r>
+              <w:t xml:space="preserve"> </w:t>
+            </w:r>
+            <w:r>
+              <w:rPr>
+                <w:bCs/>
+                <w:b/>
+              </w:rPr>
+              <w:t xml:space="preserve">insensitive at scale</w:t>
+            </w:r>
+            <w:r>
+              <w:t xml:space="preserve">.</w:t>
+            </w:r>
+          </w:p>
+        </w:tc>
+      </w:tr>
+      <w:tr>
+        <w:tc>
+          <w:tcPr/>
+          <w:p>
+            <w:pPr>
+              <w:pStyle w:val="Compact"/>
+              <w:jc w:val="left"/>
+            </w:pPr>
+            <w:r>
+              <w:rPr>
+                <w:bCs/>
+                <w:b/>
+              </w:rPr>
+              <w:t xml:space="preserve">A forecast / target</w:t>
+            </w:r>
+            <w:r>
+              <w:t xml:space="preserve"> </w:t>
+            </w:r>
+            <w:r>
+              <w:t xml:space="preserve">(expected future customer count — a planning number)</w:t>
+            </w:r>
+          </w:p>
+        </w:tc>
+        <w:tc>
+          <w:tcPr/>
+          <w:p>
+            <w:pPr>
+              <w:pStyle w:val="Compact"/>
+              <w:jc w:val="left"/>
+            </w:pPr>
+            <w:r>
+              <w:t xml:space="preserve">γ measures</w:t>
+            </w:r>
+            <w:r>
+              <w:t xml:space="preserve"> </w:t>
+            </w:r>
+            <w:r>
+              <w:rPr>
+                <w:bCs/>
+                <w:b/>
+              </w:rPr>
+              <w:t xml:space="preserve">how full this region is relative to a capacity plan</w:t>
+            </w:r>
+            <w:r>
+              <w:t xml:space="preserve">. It stays meaningful at scale because the denominator is a planning target, not an ever-growing count.</w:t>
+            </w:r>
+          </w:p>
+        </w:tc>
+        <w:tc>
+          <w:tcPr/>
+          <w:p>
+            <w:pPr>
+              <w:pStyle w:val="Compact"/>
+              <w:jc w:val="left"/>
+            </w:pPr>
+            <w:r>
+              <w:rPr>
+                <w:bCs/>
+                <w:b/>
+              </w:rPr>
+              <w:t xml:space="preserve">Where does the forecast come from?</w:t>
+            </w:r>
+            <w:r>
+              <w:t xml:space="preserve"> </w:t>
+            </w:r>
+            <w:r>
+              <w:t xml:space="preserve">Who sets it? How often is it updated? Is it per-geography or global? The baseline does not say. This is the core of your question — assuming a known customer target presumes we know demand, but</w:t>
+            </w:r>
+            <w:r>
+              <w:t xml:space="preserve"> </w:t>
+            </w:r>
+            <w:r>
+              <w:rPr>
+                <w:bCs/>
+                <w:b/>
+              </w:rPr>
+              <w:t xml:space="preserve">no two customers are alike</w:t>
+            </w:r>
+            <w:r>
+              <w:t xml:space="preserve">.</w:t>
+            </w:r>
+          </w:p>
+        </w:tc>
+      </w:tr>
+      <w:tr>
+        <w:tc>
+          <w:tcPr/>
+          <w:p>
+            <w:pPr>
+              <w:pStyle w:val="Compact"/>
+              <w:jc w:val="left"/>
+            </w:pPr>
+            <w:r>
+              <w:rPr>
+                <w:bCs/>
+                <w:b/>
+              </w:rPr>
+              <w:t xml:space="preserve">A configurable policy constant</w:t>
+            </w:r>
+            <w:r>
+              <w:t xml:space="preserve"> </w:t>
+            </w:r>
+            <w:r>
+              <w:t xml:space="preserve">(e.g. </w:t>
+            </w:r>
+            <w:r>
+              <w:t xml:space="preserve">“</w:t>
+            </w:r>
+            <w:r>
+              <w:t xml:space="preserve">20</w:t>
+            </w:r>
+            <w:r>
+              <w:t xml:space="preserve">”</w:t>
+            </w:r>
+            <w:r>
+              <w:t xml:space="preserve"> </w:t>
+            </w:r>
+            <w:r>
+              <w:t xml:space="preserve">as a soft target per geography)</w:t>
+            </w:r>
+          </w:p>
+        </w:tc>
+        <w:tc>
+          <w:tcPr/>
+          <w:p>
+            <w:pPr>
+              <w:pStyle w:val="Compact"/>
+              <w:jc w:val="left"/>
+            </w:pPr>
+            <w:r>
+              <w:t xml:space="preserve">γ becomes a</w:t>
+            </w:r>
+            <w:r>
+              <w:t xml:space="preserve"> </w:t>
+            </w:r>
+            <w:r>
+              <w:rPr>
+                <w:bCs/>
+                <w:b/>
+              </w:rPr>
+              <w:t xml:space="preserve">governance lever</w:t>
+            </w:r>
+            <w:r>
+              <w:t xml:space="preserve"> </w:t>
+            </w:r>
+            <w:r>
+              <w:t xml:space="preserve">— the team decides how many customers a geography should absorb before scoring penalises concentration.</w:t>
+            </w:r>
+          </w:p>
+        </w:tc>
+        <w:tc>
+          <w:tcPr/>
+          <w:p>
+            <w:pPr>
+              <w:pStyle w:val="Compact"/>
+              <w:jc w:val="left"/>
+            </w:pPr>
+            <w:r>
+              <w:t xml:space="preserve">Must be defined, versioned, and documented in the Configurable Items Register (Section 22). Currently absent.</w:t>
+            </w:r>
+          </w:p>
+        </w:tc>
+      </w:tr>
+      <w:tr>
+        <w:tc>
+          <w:tcPr/>
+          <w:p>
+            <w:pPr>
+              <w:pStyle w:val="Compact"/>
+              <w:jc w:val="left"/>
+            </w:pPr>
+            <w:r>
+              <w:rPr>
+                <w:bCs/>
+                <w:b/>
+              </w:rPr>
+              <w:t xml:space="preserve">Sum of region_customer_counts</w:t>
+            </w:r>
+            <w:r>
+              <w:t xml:space="preserve"> </w:t>
+            </w:r>
+            <w:r>
+              <w:t xml:space="preserve">(i.e., the total across the candidate set)</w:t>
+            </w:r>
+          </w:p>
+        </w:tc>
+        <w:tc>
+          <w:tcPr/>
+          <w:p>
+            <w:pPr>
+              <w:pStyle w:val="Compact"/>
+              <w:jc w:val="left"/>
+            </w:pPr>
+            <w:r>
+              <w:t xml:space="preserve">γ computes a</w:t>
+            </w:r>
+            <w:r>
+              <w:t xml:space="preserve"> </w:t>
+            </w:r>
+            <w:r>
+              <w:rPr>
+                <w:bCs/>
+                <w:b/>
+              </w:rPr>
+              <w:t xml:space="preserve">simple proportion</w:t>
+            </w:r>
+            <w:r>
+              <w:t xml:space="preserve"> </w:t>
+            </w:r>
+            <w:r>
+              <w:t xml:space="preserve">of the geography’s customers in each region. This is always fresh (derived from the snapshot) and needs no external input.</w:t>
+            </w:r>
+          </w:p>
+        </w:tc>
+        <w:tc>
+          <w:tcPr/>
+          <w:p>
+            <w:pPr>
+              <w:pStyle w:val="Compact"/>
+              <w:jc w:val="left"/>
+            </w:pPr>
+            <w:r>
+              <w:t xml:space="preserve">Mathematically valid but potentially a different design intent than</w:t>
+            </w:r>
+            <w:r>
+              <w:t xml:space="preserve"> </w:t>
+            </w:r>
+            <w:r>
+              <w:t xml:space="preserve">“</w:t>
+            </w:r>
+            <w:r>
+              <w:t xml:space="preserve">fairness against a target.</w:t>
+            </w:r>
+            <w:r>
+              <w:t xml:space="preserve">”</w:t>
+            </w:r>
+          </w:p>
+        </w:tc>
+      </w:tr>
+    </w:tbl>
+    <w:bookmarkEnd w:id="27"/>
+    <w:bookmarkStart w:id="28" w:name="X921a734049bd52f5a2f3cdd46030ae7ade7536b"/>
+    <w:p>
+      <w:pPr>
+        <w:pStyle w:val="Heading4"/>
+      </w:pPr>
+      <w:r>
+        <w:t xml:space="preserve">What this walkthrough assumes (and why it may be wrong)</w:t>
+      </w:r>
+    </w:p>
+    <w:p>
+      <w:pPr>
+        <w:pStyle w:val="FirstParagraph"/>
+      </w:pPr>
+      <w:r>
+        <w:t xml:space="preserve">The worked examples in this document use</w:t>
+      </w:r>
+      <w:r>
+        <w:t xml:space="preserve"> </w:t>
+      </w:r>
+      <w:r>
+        <w:rPr>
+          <w:bCs/>
+          <w:b/>
+        </w:rPr>
+        <w:t xml:space="preserve">20</w:t>
+      </w:r>
+      <w:r>
+        <w:t xml:space="preserve"> </w:t>
+      </w:r>
+      <w:r>
+        <w:t xml:space="preserve">as</w:t>
+      </w:r>
+      <w:r>
+        <w:t xml:space="preserve"> </w:t>
+      </w:r>
+      <w:r>
+        <w:rPr>
+          <w:rStyle w:val="VerbatimChar"/>
+        </w:rPr>
+        <w:t xml:space="preserve">total_customers</w:t>
+      </w:r>
+      <w:r>
+        <w:t xml:space="preserve"> </w:t>
+      </w:r>
+      <w:r>
+        <w:t xml:space="preserve">for US and</w:t>
+      </w:r>
+      <w:r>
+        <w:t xml:space="preserve"> </w:t>
+      </w:r>
+      <w:r>
+        <w:rPr>
+          <w:bCs/>
+          <w:b/>
+        </w:rPr>
+        <w:t xml:space="preserve">15</w:t>
+      </w:r>
+      <w:r>
+        <w:t xml:space="preserve"> </w:t>
+      </w:r>
+      <w:r>
+        <w:t xml:space="preserve">for EU. These numbers were chosen to make the arithmetic illustrative. They could represent:</w:t>
+      </w:r>
+    </w:p>
+    <w:p>
+      <w:pPr>
+        <w:numPr>
+          <w:ilvl w:val="0"/>
+          <w:numId w:val="1002"/>
+        </w:numPr>
+        <w:pStyle w:val="Compact"/>
+      </w:pPr>
+      <w:r>
+        <w:t xml:space="preserve">The count of distinct Customer IDs with an approved seed record in that geography at snapshot time, OR</w:t>
+      </w:r>
+    </w:p>
+    <w:p>
+      <w:pPr>
+        <w:numPr>
+          <w:ilvl w:val="0"/>
+          <w:numId w:val="1002"/>
+        </w:numPr>
+        <w:pStyle w:val="Compact"/>
+      </w:pPr>
+      <w:r>
+        <w:t xml:space="preserve">A planning target, OR</w:t>
+      </w:r>
+    </w:p>
+    <w:p>
+      <w:pPr>
+        <w:numPr>
+          <w:ilvl w:val="0"/>
+          <w:numId w:val="1002"/>
+        </w:numPr>
+        <w:pStyle w:val="Compact"/>
+      </w:pPr>
+      <w:r>
+        <w:t xml:space="preserve">An arbitrary example value</w:t>
+      </w:r>
+    </w:p>
+    <w:p>
+      <w:pPr>
+        <w:pStyle w:val="FirstParagraph"/>
+      </w:pPr>
+      <w:r>
+        <w:rPr>
+          <w:bCs/>
+          <w:b/>
+        </w:rPr>
+        <w:t xml:space="preserve">The walkthrough does not know which interpretation is correct, because the baseline does not say.</w:t>
+      </w:r>
+      <w:r>
+        <w:t xml:space="preserve"> </w:t>
+      </w:r>
+      <w:r>
+        <w:t xml:space="preserve">The γ component arithmetic shown below is mechanically accurate for any definition — the formula works the same way regardless — but the</w:t>
+      </w:r>
+      <w:r>
+        <w:t xml:space="preserve"> </w:t>
+      </w:r>
+      <w:r>
+        <w:rPr>
+          <w:iCs/>
+          <w:i/>
+        </w:rPr>
+        <w:t xml:space="preserve">meaning</w:t>
+      </w:r>
+      <w:r>
+        <w:t xml:space="preserve"> </w:t>
+      </w:r>
+      <w:r>
+        <w:t xml:space="preserve">of the score depends entirely on what</w:t>
+      </w:r>
+      <w:r>
+        <w:t xml:space="preserve"> </w:t>
+      </w:r>
+      <w:r>
+        <w:rPr>
+          <w:rStyle w:val="VerbatimChar"/>
+        </w:rPr>
+        <w:t xml:space="preserve">total_customers</w:t>
+      </w:r>
+      <w:r>
+        <w:t xml:space="preserve"> </w:t>
+      </w:r>
+      <w:r>
+        <w:t xml:space="preserve">actually is.</w:t>
+      </w:r>
+    </w:p>
+    <w:bookmarkEnd w:id="28"/>
+    <w:bookmarkStart w:id="29" w:name="what-needs-to-happen"/>
+    <w:p>
+      <w:pPr>
+        <w:pStyle w:val="Heading4"/>
+      </w:pPr>
+      <w:r>
+        <w:t xml:space="preserve">What needs to happen</w:t>
+      </w:r>
+    </w:p>
+    <w:p>
+      <w:pPr>
+        <w:pStyle w:val="FirstParagraph"/>
+      </w:pPr>
+      <w:r>
+        <w:t xml:space="preserve">This is a</w:t>
+      </w:r>
+      <w:r>
+        <w:t xml:space="preserve"> </w:t>
+      </w:r>
+      <w:r>
+        <w:rPr>
+          <w:bCs/>
+          <w:b/>
+        </w:rPr>
+        <w:t xml:space="preserve">design gap</w:t>
+      </w:r>
+      <w:r>
+        <w:t xml:space="preserve"> </w:t>
+      </w:r>
+      <w:r>
+        <w:t xml:space="preserve">that must be resolved before the scoring engine can be implemented:</w:t>
+      </w:r>
+    </w:p>
+    <w:p>
+      <w:pPr>
+        <w:numPr>
+          <w:ilvl w:val="0"/>
+          <w:numId w:val="1003"/>
+        </w:numPr>
+        <w:pStyle w:val="Compact"/>
+      </w:pPr>
+      <w:r>
+        <w:rPr>
+          <w:bCs/>
+          <w:b/>
+        </w:rPr>
+        <w:t xml:space="preserve">Define</w:t>
+      </w:r>
+      <w:r>
+        <w:rPr>
+          <w:bCs/>
+          <w:b/>
+        </w:rPr>
+        <w:t xml:space="preserve"> </w:t>
+      </w:r>
+      <w:r>
+        <w:rPr>
+          <w:rStyle w:val="VerbatimChar"/>
+          <w:bCs/>
+          <w:b/>
+        </w:rPr>
+        <w:t xml:space="preserve">total_customers</w:t>
+      </w:r>
+      <w:r>
+        <w:t xml:space="preserve"> </w:t>
+      </w:r>
+      <w:r>
+        <w:t xml:space="preserve">— add it to Section 4 (Terminology) and Appendix A of the Requirements Baseline v2.4.</w:t>
+      </w:r>
+    </w:p>
+    <w:p>
+      <w:pPr>
+        <w:numPr>
+          <w:ilvl w:val="0"/>
+          <w:numId w:val="1003"/>
+        </w:numPr>
+        <w:pStyle w:val="Compact"/>
+      </w:pPr>
+      <w:r>
+        <w:rPr>
+          <w:bCs/>
+          <w:b/>
+        </w:rPr>
+        <w:t xml:space="preserve">Specify its source</w:t>
+      </w:r>
+      <w:r>
+        <w:t xml:space="preserve"> </w:t>
+      </w:r>
+      <w:r>
+        <w:t xml:space="preserve">— is it a snapshot field (derived from seed records at scoring time), a configurable policy constant, or a forecast input?</w:t>
+      </w:r>
+    </w:p>
+    <w:p>
+      <w:pPr>
+        <w:numPr>
+          <w:ilvl w:val="0"/>
+          <w:numId w:val="1003"/>
+        </w:numPr>
+        <w:pStyle w:val="Compact"/>
+      </w:pPr>
+      <w:r>
+        <w:rPr>
+          <w:bCs/>
+          <w:b/>
+        </w:rPr>
+        <w:t xml:space="preserve">Specify its scope</w:t>
+      </w:r>
+      <w:r>
+        <w:t xml:space="preserve"> </w:t>
+      </w:r>
+      <w:r>
+        <w:t xml:space="preserve">— is it per-geography, per-environment, or global?</w:t>
+      </w:r>
+    </w:p>
+    <w:p>
+      <w:pPr>
+        <w:numPr>
+          <w:ilvl w:val="0"/>
+          <w:numId w:val="1003"/>
+        </w:numPr>
+        <w:pStyle w:val="Compact"/>
+      </w:pPr>
+      <w:r>
+        <w:rPr>
+          <w:bCs/>
+          <w:b/>
+        </w:rPr>
+        <w:t xml:space="preserve">Add it to the Configurable Items Register</w:t>
+      </w:r>
+      <w:r>
+        <w:t xml:space="preserve"> </w:t>
+      </w:r>
+      <w:r>
+        <w:t xml:space="preserve">(Section 22) if it is a policy input.</w:t>
+      </w:r>
+    </w:p>
+    <w:p>
+      <w:pPr>
+        <w:numPr>
+          <w:ilvl w:val="0"/>
+          <w:numId w:val="1003"/>
+        </w:numPr>
+        <w:pStyle w:val="Compact"/>
+      </w:pPr>
+      <w:r>
+        <w:rPr>
+          <w:bCs/>
+          <w:b/>
+        </w:rPr>
+        <w:t xml:space="preserve">Validate with a POC</w:t>
+      </w:r>
+      <w:r>
+        <w:t xml:space="preserve"> </w:t>
+      </w:r>
+      <w:r>
+        <w:t xml:space="preserve">— does γ actually spread customers evenly? At what estate size does it become too weak to influence scoring? Should a different fairness metric (e.g., Gini coefficient, max-region cap) replace or complement it?</w:t>
+      </w:r>
+    </w:p>
+    <w:p>
+      <w:pPr>
+        <w:pStyle w:val="BlockText"/>
+      </w:pPr>
+      <w:r>
+        <w:rPr>
+          <w:bCs/>
+          <w:b/>
+        </w:rPr>
+        <w:t xml:space="preserve">Bottom line:</w:t>
+      </w:r>
+      <w:r>
+        <w:t xml:space="preserve"> </w:t>
+      </w:r>
+      <w:r>
+        <w:t xml:space="preserve">The examples below demonstrate the scoring</w:t>
+      </w:r>
+      <w:r>
+        <w:t xml:space="preserve"> </w:t>
+      </w:r>
+      <w:r>
+        <w:rPr>
+          <w:iCs/>
+          <w:i/>
+        </w:rPr>
+        <w:t xml:space="preserve">mechanics</w:t>
+      </w:r>
+      <w:r>
+        <w:t xml:space="preserve"> </w:t>
+      </w:r>
+      <w:r>
+        <w:t xml:space="preserve">faithfully. But the</w:t>
+      </w:r>
+      <w:r>
+        <w:t xml:space="preserve"> </w:t>
+      </w:r>
+      <w:r>
+        <w:rPr>
+          <w:rStyle w:val="VerbatimChar"/>
+        </w:rPr>
+        <w:t xml:space="preserve">total_customers</w:t>
+      </w:r>
+      <w:r>
+        <w:t xml:space="preserve"> </w:t>
+      </w:r>
+      <w:r>
+        <w:t xml:space="preserve">denominator is an</w:t>
+      </w:r>
+      <w:r>
+        <w:t xml:space="preserve"> </w:t>
+      </w:r>
+      <w:r>
+        <w:rPr>
+          <w:bCs/>
+          <w:b/>
+        </w:rPr>
+        <w:t xml:space="preserve">unresolved design question</w:t>
+      </w:r>
+      <w:r>
+        <w:t xml:space="preserve">, not a settled parameter. Treat the absolute γ values as illustrative until the baseline defines this term.</w:t>
+      </w:r>
+    </w:p>
+    <w:p>
+      <w:r>
+        <w:pict>
+          <v:rect style="width:0;height:1.5pt" o:hralign="center" o:hrstd="t" o:hr="t"/>
+        </w:pict>
+      </w:r>
+    </w:p>
+    <w:bookmarkEnd w:id="29"/>
+    <w:bookmarkEnd w:id="30"/>
+    <w:bookmarkEnd w:id="31"/>
+    <w:bookmarkStart w:id="45" w:name="X9dc3f2ea4bc0f2077944752d1f814fb25d7f86c"/>
     <w:p>
       <w:pPr>
         <w:pStyle w:val="Heading2"/>
@@ -1675,7 +2814,7 @@
         <w:t xml:space="preserve">US REGION SELECTION — Customer deploys E16ads_v5 (48 vCPU needed)</w:t>
       </w:r>
     </w:p>
-    <w:bookmarkStart w:id="31" w:name="Xacc0d065f638cb9cb5e264f66f6ac0648d48d0e"/>
+    <w:bookmarkStart w:id="36" w:name="Xacc0d065f638cb9cb5e264f66f6ac0648d48d0e"/>
     <w:p>
       <w:pPr>
         <w:pStyle w:val="Heading3"/>
@@ -1702,7 +2841,7 @@
         <w:t xml:space="preserve">(default/exact path)</w:t>
       </w:r>
     </w:p>
-    <w:bookmarkStart w:id="27" w:name="step-1-hard-constraint-gate-passfail"/>
+    <w:bookmarkStart w:id="32" w:name="step-1-hard-constraint-gate-passfail"/>
     <w:p>
       <w:pPr>
         <w:pStyle w:val="Heading4"/>
@@ -2146,8 +3285,8 @@
         <w:t xml:space="preserve">Prod = Central US ✅</w:t>
       </w:r>
     </w:p>
-    <w:bookmarkEnd w:id="27"/>
-    <w:bookmarkStart w:id="28" w:name="step-2-cval-region-selection"/>
+    <w:bookmarkEnd w:id="32"/>
+    <w:bookmarkStart w:id="33" w:name="step-2-cval-region-selection"/>
     <w:p>
       <w:pPr>
         <w:pStyle w:val="Heading4"/>
@@ -2315,8 +3454,8 @@
         <w:t xml:space="preserve">CVAL = Canada Central ✅</w:t>
       </w:r>
     </w:p>
-    <w:bookmarkEnd w:id="28"/>
-    <w:bookmarkStart w:id="29" w:name="step-3-dr-region-selection"/>
+    <w:bookmarkEnd w:id="33"/>
+    <w:bookmarkStart w:id="34" w:name="step-3-dr-region-selection"/>
     <w:p>
       <w:pPr>
         <w:pStyle w:val="Heading4"/>
@@ -2463,8 +3602,8 @@
         <w:t xml:space="preserve">DR = West US 3 ✅ (dedicated, better than co-locating)</w:t>
       </w:r>
     </w:p>
-    <w:bookmarkEnd w:id="29"/>
-    <w:bookmarkStart w:id="30" w:name="happy-path-result-us-e16ads_v5"/>
+    <w:bookmarkEnd w:id="34"/>
+    <w:bookmarkStart w:id="35" w:name="happy-path-result-us-e16ads_v5"/>
     <w:p>
       <w:pPr>
         <w:pStyle w:val="Heading4"/>
@@ -2517,9 +3656,9 @@
         </w:pict>
       </w:r>
     </w:p>
-    <w:bookmarkEnd w:id="30"/>
-    <w:bookmarkEnd w:id="31"/>
-    <w:bookmarkStart w:id="35" w:name="Xabae5b09cec5bd7529e0e82282615693e1467f3"/>
+    <w:bookmarkEnd w:id="35"/>
+    <w:bookmarkEnd w:id="36"/>
+    <w:bookmarkStart w:id="40" w:name="Xabae5b09cec5bd7529e0e82282615693e1467f3"/>
     <w:p>
       <w:pPr>
         <w:pStyle w:val="Heading3"/>
@@ -2536,7 +3675,7 @@
         <w:t xml:space="preserve">Assume Central US quota headroom = 12 vCPU (almost no room left)</w:t>
       </w:r>
     </w:p>
-    <w:bookmarkStart w:id="32" w:name="step-1-hard-constraint-gate"/>
+    <w:bookmarkStart w:id="37" w:name="step-1-hard-constraint-gate"/>
     <w:p>
       <w:pPr>
         <w:pStyle w:val="Heading4"/>
@@ -2696,8 +3835,8 @@
         <w:t xml:space="preserve">QUOTA_DEFICIT</w:t>
       </w:r>
     </w:p>
-    <w:bookmarkEnd w:id="32"/>
-    <w:bookmarkStart w:id="33" w:name="what-happens-next"/>
+    <w:bookmarkEnd w:id="37"/>
+    <w:bookmarkStart w:id="38" w:name="what-happens-next"/>
     <w:p>
       <w:pPr>
         <w:pStyle w:val="Heading4"/>
@@ -2710,7 +3849,7 @@
       <w:pPr>
         <w:numPr>
           <w:ilvl w:val="0"/>
-          <w:numId w:val="1002"/>
+          <w:numId w:val="1004"/>
         </w:numPr>
         <w:pStyle w:val="Compact"/>
       </w:pPr>
@@ -2750,7 +3889,7 @@
       <w:pPr>
         <w:numPr>
           <w:ilvl w:val="0"/>
-          <w:numId w:val="1002"/>
+          <w:numId w:val="1004"/>
         </w:numPr>
         <w:pStyle w:val="Compact"/>
       </w:pPr>
@@ -2777,7 +3916,7 @@
       <w:pPr>
         <w:numPr>
           <w:ilvl w:val="0"/>
-          <w:numId w:val="1002"/>
+          <w:numId w:val="1004"/>
         </w:numPr>
         <w:pStyle w:val="Compact"/>
       </w:pPr>
@@ -2789,7 +3928,7 @@
       <w:pPr>
         <w:numPr>
           <w:ilvl w:val="0"/>
-          <w:numId w:val="1002"/>
+          <w:numId w:val="1004"/>
         </w:numPr>
         <w:pStyle w:val="Compact"/>
       </w:pPr>
@@ -2817,7 +3956,7 @@
       <w:pPr>
         <w:numPr>
           <w:ilvl w:val="0"/>
-          <w:numId w:val="1002"/>
+          <w:numId w:val="1004"/>
         </w:numPr>
         <w:pStyle w:val="Compact"/>
       </w:pPr>
@@ -2837,8 +3976,8 @@
         <w:t xml:space="preserve">.</w:t>
       </w:r>
     </w:p>
-    <w:bookmarkEnd w:id="33"/>
-    <w:bookmarkStart w:id="34" w:name="Xd03e00739b70449b6fc2801da143f7f553daedf"/>
+    <w:bookmarkEnd w:id="38"/>
+    <w:bookmarkStart w:id="39" w:name="Xd03e00739b70449b6fc2801da143f7f553daedf"/>
     <w:p>
       <w:pPr>
         <w:pStyle w:val="Heading4"/>
@@ -2869,9 +4008,9 @@
         </w:pict>
       </w:r>
     </w:p>
-    <w:bookmarkEnd w:id="34"/>
-    <w:bookmarkEnd w:id="35"/>
-    <w:bookmarkStart w:id="39" w:name="X5ed24a1dafd4430896454707b011c920e058129"/>
+    <w:bookmarkEnd w:id="39"/>
+    <w:bookmarkEnd w:id="40"/>
+    <w:bookmarkStart w:id="44" w:name="X5ed24a1dafd4430896454707b011c920e058129"/>
     <w:p>
       <w:pPr>
         <w:pStyle w:val="Heading3"/>
@@ -2924,7 +4063,7 @@
         <w:t xml:space="preserve">— no specific region named</w:t>
       </w:r>
     </w:p>
-    <w:bookmarkStart w:id="36" w:name="step-1-governance-gate-fires-first"/>
+    <w:bookmarkStart w:id="41" w:name="step-1-governance-gate-fires-first"/>
     <w:p>
       <w:pPr>
         <w:pStyle w:val="Heading4"/>
@@ -2937,7 +4076,7 @@
       <w:pPr>
         <w:numPr>
           <w:ilvl w:val="0"/>
-          <w:numId w:val="1003"/>
+          <w:numId w:val="1005"/>
         </w:numPr>
         <w:pStyle w:val="Compact"/>
       </w:pPr>
@@ -2965,7 +4104,7 @@
       <w:pPr>
         <w:numPr>
           <w:ilvl w:val="0"/>
-          <w:numId w:val="1003"/>
+          <w:numId w:val="1005"/>
         </w:numPr>
         <w:pStyle w:val="Compact"/>
       </w:pPr>
@@ -2992,7 +4131,7 @@
       <w:pPr>
         <w:numPr>
           <w:ilvl w:val="0"/>
-          <w:numId w:val="1003"/>
+          <w:numId w:val="1005"/>
         </w:numPr>
         <w:pStyle w:val="Compact"/>
       </w:pPr>
@@ -3000,8 +4139,8 @@
         <w:t xml:space="preserve">If approval obtained: score all 3 Standard regions.</w:t>
       </w:r>
     </w:p>
-    <w:bookmarkEnd w:id="36"/>
-    <w:bookmarkStart w:id="37" w:name="step-2-score-all-three-with-ps_prod"/>
+    <w:bookmarkEnd w:id="41"/>
+    <w:bookmarkStart w:id="42" w:name="step-2-score-all-three-with-ps_prod"/>
     <w:p>
       <w:pPr>
         <w:pStyle w:val="Heading4"/>
@@ -3200,8 +4339,8 @@
         <w:t xml:space="preserve">”</w:t>
       </w:r>
     </w:p>
-    <w:bookmarkEnd w:id="37"/>
-    <w:bookmarkStart w:id="38" w:name="X27c4c48cc45b5c3225322141a03e98e937d575f"/>
+    <w:bookmarkEnd w:id="42"/>
+    <w:bookmarkStart w:id="43" w:name="X27c4c48cc45b5c3225322141a03e98e937d575f"/>
     <w:p>
       <w:pPr>
         <w:pStyle w:val="Heading4"/>
@@ -3217,10 +4356,10 @@
         </w:pict>
       </w:r>
     </w:p>
-    <w:bookmarkEnd w:id="38"/>
-    <w:bookmarkEnd w:id="39"/>
-    <w:bookmarkEnd w:id="40"/>
-    <w:bookmarkStart w:id="51" w:name="X495f7d09641e7787f785c8a6ff11700386a3c0c"/>
+    <w:bookmarkEnd w:id="43"/>
+    <w:bookmarkEnd w:id="44"/>
+    <w:bookmarkEnd w:id="45"/>
+    <w:bookmarkStart w:id="56" w:name="X495f7d09641e7787f785c8a6ff11700386a3c0c"/>
     <w:p>
       <w:pPr>
         <w:pStyle w:val="Heading2"/>
@@ -3253,7 +4392,7 @@
         <w:t xml:space="preserve">(both share one region), because the design allows DR to share with NonProd (ENV-003).</w:t>
       </w:r>
     </w:p>
-    <w:bookmarkStart w:id="45" w:name="X1a2092dc346c035ca5d75d82f2a57acf5467c2d"/>
+    <w:bookmarkStart w:id="50" w:name="X1a2092dc346c035ca5d75d82f2a57acf5467c2d"/>
     <w:p>
       <w:pPr>
         <w:pStyle w:val="Heading3"/>
@@ -3274,7 +4413,7 @@
         <w:t xml:space="preserve">”</w:t>
       </w:r>
     </w:p>
-    <w:bookmarkStart w:id="41" w:name="X499b6a599a215696cc75af62c4900ced188fbfa"/>
+    <w:bookmarkStart w:id="46" w:name="X499b6a599a215696cc75af62c4900ced188fbfa"/>
     <w:p>
       <w:pPr>
         <w:pStyle w:val="Heading4"/>
@@ -3517,8 +4656,8 @@
         <w:t xml:space="preserve">Prod = Switzerland North.</w:t>
       </w:r>
     </w:p>
-    <w:bookmarkEnd w:id="41"/>
-    <w:bookmarkStart w:id="42" w:name="step-2-cval-selection"/>
+    <w:bookmarkEnd w:id="46"/>
+    <w:bookmarkStart w:id="47" w:name="step-2-cval-selection"/>
     <w:p>
       <w:pPr>
         <w:pStyle w:val="Heading4"/>
@@ -3561,8 +4700,8 @@
         <w:t xml:space="preserve">CVAL = Sweden Central ✅</w:t>
       </w:r>
     </w:p>
-    <w:bookmarkEnd w:id="42"/>
-    <w:bookmarkStart w:id="43" w:name="step-3-dr-selection"/>
+    <w:bookmarkEnd w:id="47"/>
+    <w:bookmarkStart w:id="48" w:name="step-3-dr-selection"/>
     <w:p>
       <w:pPr>
         <w:pStyle w:val="Heading4"/>
@@ -3607,8 +4746,8 @@
         <w:t xml:space="preserve">DR = Sweden Central (co-located with CVAL) ✅</w:t>
       </w:r>
     </w:p>
-    <w:bookmarkEnd w:id="43"/>
-    <w:bookmarkStart w:id="44" w:name="happy-path-result-eu-e8ads_v5"/>
+    <w:bookmarkEnd w:id="48"/>
+    <w:bookmarkStart w:id="49" w:name="happy-path-result-eu-e8ads_v5"/>
     <w:p>
       <w:pPr>
         <w:pStyle w:val="Heading4"/>
@@ -3660,9 +4799,9 @@
         </w:pict>
       </w:r>
     </w:p>
-    <w:bookmarkEnd w:id="44"/>
-    <w:bookmarkEnd w:id="45"/>
-    <w:bookmarkStart w:id="50" w:name="X631a64289676ecadc4e275b7ab4e574658214ac"/>
+    <w:bookmarkEnd w:id="49"/>
+    <w:bookmarkEnd w:id="50"/>
+    <w:bookmarkStart w:id="55" w:name="X631a64289676ecadc4e275b7ab4e574658214ac"/>
     <w:p>
       <w:pPr>
         <w:pStyle w:val="Heading3"/>
@@ -3679,7 +4818,7 @@
         <w:t xml:space="preserve">Assume Switzerland North has only 30 vCPU headroom remaining</w:t>
       </w:r>
     </w:p>
-    <w:bookmarkStart w:id="46" w:name="step-1-hc-gate-for-switzerland-north"/>
+    <w:bookmarkStart w:id="51" w:name="step-1-hc-gate-for-switzerland-north"/>
     <w:p>
       <w:pPr>
         <w:pStyle w:val="Heading4"/>
@@ -3812,8 +4951,8 @@
         <w:t xml:space="preserve">Switzerland North fails. No other Standard EU Prod region is available (Sweden Central is the only alternative).</w:t>
       </w:r>
     </w:p>
-    <w:bookmarkEnd w:id="46"/>
-    <w:bookmarkStart w:id="47" w:name="try-sweden-central-for-prod"/>
+    <w:bookmarkEnd w:id="51"/>
+    <w:bookmarkStart w:id="52" w:name="try-sweden-central-for-prod"/>
     <w:p>
       <w:pPr>
         <w:pStyle w:val="Heading4"/>
@@ -3956,8 +5095,8 @@
         <w:t xml:space="preserve">(only viable option)</w:t>
       </w:r>
     </w:p>
-    <w:bookmarkEnd w:id="47"/>
-    <w:bookmarkStart w:id="48" w:name="X190ebb453ab974b0482899e89479604aa567de9"/>
+    <w:bookmarkEnd w:id="52"/>
+    <w:bookmarkStart w:id="53" w:name="X190ebb453ab974b0482899e89479604aa567de9"/>
     <w:p>
       <w:pPr>
         <w:pStyle w:val="Heading4"/>
@@ -4009,8 +5148,8 @@
         <w:t xml:space="preserve">Both Standard EU buildings cannot satisfy E16ads_v5 demand simultaneously. Deployment cannot be placed.</w:t>
       </w:r>
     </w:p>
-    <w:bookmarkEnd w:id="48"/>
-    <w:bookmarkStart w:id="49" w:name="X183dd7dbd75159705663c3900b6a5edda83a87a"/>
+    <w:bookmarkEnd w:id="53"/>
+    <w:bookmarkStart w:id="54" w:name="X183dd7dbd75159705663c3900b6a5edda83a87a"/>
     <w:p>
       <w:pPr>
         <w:pStyle w:val="Heading4"/>
@@ -4038,7 +5177,7 @@
       <w:pPr>
         <w:numPr>
           <w:ilvl w:val="0"/>
-          <w:numId w:val="1004"/>
+          <w:numId w:val="1006"/>
         </w:numPr>
         <w:pStyle w:val="Compact"/>
       </w:pPr>
@@ -4060,7 +5199,7 @@
       <w:pPr>
         <w:numPr>
           <w:ilvl w:val="0"/>
-          <w:numId w:val="1004"/>
+          <w:numId w:val="1006"/>
         </w:numPr>
         <w:pStyle w:val="Compact"/>
       </w:pPr>
@@ -4082,7 +5221,7 @@
       <w:pPr>
         <w:numPr>
           <w:ilvl w:val="0"/>
-          <w:numId w:val="1004"/>
+          <w:numId w:val="1006"/>
         </w:numPr>
         <w:pStyle w:val="Compact"/>
       </w:pPr>
@@ -4107,10 +5246,10 @@
         </w:pict>
       </w:r>
     </w:p>
-    <w:bookmarkEnd w:id="49"/>
-    <w:bookmarkEnd w:id="50"/>
-    <w:bookmarkEnd w:id="51"/>
-    <w:bookmarkStart w:id="56" w:name="part-2-quota-management"/>
+    <w:bookmarkEnd w:id="54"/>
+    <w:bookmarkEnd w:id="55"/>
+    <w:bookmarkEnd w:id="56"/>
+    <w:bookmarkStart w:id="61" w:name="part-2-quota-management"/>
     <w:p>
       <w:pPr>
         <w:pStyle w:val="Heading2"/>
@@ -4119,7 +5258,7 @@
         <w:t xml:space="preserve">PART 2 — QUOTA MANAGEMENT</w:t>
       </w:r>
     </w:p>
-    <w:bookmarkStart w:id="52" w:name="what-is-quota-management"/>
+    <w:bookmarkStart w:id="57" w:name="what-is-quota-management"/>
     <w:p>
       <w:pPr>
         <w:pStyle w:val="Heading3"/>
@@ -4152,8 +5291,8 @@
         <w:t xml:space="preserve">issued by the local authority (Microsoft). Even if you have empty desks (capacity), you cannot seat more people than your permit allows. Quota management keeps the permit large enough for today plus planned growth, without wasting money on unused permit space.</w:t>
       </w:r>
     </w:p>
-    <w:bookmarkEnd w:id="52"/>
-    <w:bookmarkStart w:id="55" w:name="why-are-the-growth-buffer-constants-20"/>
+    <w:bookmarkEnd w:id="57"/>
+    <w:bookmarkStart w:id="60" w:name="why-are-the-growth-buffer-constants-20"/>
     <w:p>
       <w:pPr>
         <w:pStyle w:val="Heading3"/>
@@ -4162,7 +5301,7 @@
         <w:t xml:space="preserve">Why are the growth buffer constants 20%?</w:t>
       </w:r>
     </w:p>
-    <w:bookmarkStart w:id="53" w:name="X71549bb666c59b5b65afe0b424ac6348f8360c3"/>
+    <w:bookmarkStart w:id="58" w:name="X71549bb666c59b5b65afe0b424ac6348f8360c3"/>
     <w:p>
       <w:pPr>
         <w:pStyle w:val="Heading4"/>
@@ -4201,8 +5340,8 @@
         <w:t xml:space="preserve">The 20% is the policy default — if you are using 100 desks today, the permit covers 120, so you are never caught scrambling when the next team joins. 20% balances cost (unused permit has a cost) against deployment agility (no emergency quota requests to Microsoft). This value is configurable per product/region — a fast-growing product might use 30%; a stable mature product might use 10%.</w:t>
       </w:r>
     </w:p>
-    <w:bookmarkEnd w:id="53"/>
-    <w:bookmarkStart w:id="54" w:name="X8cfaace904ed1332ca1dc6d3fd93c85b253ce17"/>
+    <w:bookmarkEnd w:id="58"/>
+    <w:bookmarkStart w:id="59" w:name="X8cfaace904ed1332ca1dc6d3fd93c85b253ce17"/>
     <w:p>
       <w:pPr>
         <w:pStyle w:val="Heading4"/>
@@ -4226,10 +5365,10 @@
         </w:pict>
       </w:r>
     </w:p>
-    <w:bookmarkEnd w:id="54"/>
-    <w:bookmarkEnd w:id="55"/>
-    <w:bookmarkEnd w:id="56"/>
-    <w:bookmarkStart w:id="62" w:name="Xc87eb9afdb68618b9441573c657bc27343eaec0"/>
+    <w:bookmarkEnd w:id="59"/>
+    <w:bookmarkEnd w:id="60"/>
+    <w:bookmarkEnd w:id="61"/>
+    <w:bookmarkStart w:id="67" w:name="Xc87eb9afdb68618b9441573c657bc27343eaec0"/>
     <w:p>
       <w:pPr>
         <w:pStyle w:val="Heading2"/>
@@ -4390,7 +5529,7 @@
         </w:tc>
       </w:tr>
     </w:tbl>
-    <w:bookmarkStart w:id="57" w:name="pool-limit-calculation"/>
+    <w:bookmarkStart w:id="62" w:name="pool-limit-calculation"/>
     <w:p>
       <w:pPr>
         <w:pStyle w:val="Heading3"/>
@@ -4464,8 +5603,8 @@
         <w:t xml:space="preserve">Pool_Limit(West US 3)        =              540 vCPU</w:t>
       </w:r>
     </w:p>
-    <w:bookmarkEnd w:id="57"/>
-    <w:bookmarkStart w:id="58" w:name="X20533d42598bfbb81d5447623532c2f2eab31dc"/>
+    <w:bookmarkEnd w:id="62"/>
+    <w:bookmarkStart w:id="63" w:name="X20533d42598bfbb81d5447623532c2f2eab31dc"/>
     <w:p>
       <w:pPr>
         <w:pStyle w:val="Heading3"/>
@@ -4524,8 +5663,8 @@
         <w:t xml:space="preserve">Pool_Headroom        = 540 - (240+120+120) = 60 vCPU       [total free space]</w:t>
       </w:r>
     </w:p>
-    <w:bookmarkEnd w:id="58"/>
-    <w:bookmarkStart w:id="59" w:name="X22cd1d71127329fbb4af52f0e80230efec8e164"/>
+    <w:bookmarkEnd w:id="63"/>
+    <w:bookmarkStart w:id="64" w:name="X22cd1d71127329fbb4af52f0e80230efec8e164"/>
     <w:p>
       <w:pPr>
         <w:pStyle w:val="Heading3"/>
@@ -4622,8 +5761,8 @@
         <w:t xml:space="preserve">state confirmed.</w:t>
       </w:r>
     </w:p>
-    <w:bookmarkEnd w:id="59"/>
-    <w:bookmarkStart w:id="61" w:name="X46e026a2352668f62fb866be373209f1cc3fca5"/>
+    <w:bookmarkEnd w:id="64"/>
+    <w:bookmarkStart w:id="66" w:name="X46e026a2352668f62fb866be373209f1cc3fca5"/>
     <w:p>
       <w:pPr>
         <w:pStyle w:val="Heading3"/>
@@ -4700,7 +5839,7 @@
         <w:t xml:space="preserve">(Critical severity)</w:t>
       </w:r>
     </w:p>
-    <w:bookmarkStart w:id="60" w:name="what-happens"/>
+    <w:bookmarkStart w:id="65" w:name="what-happens"/>
     <w:p>
       <w:pPr>
         <w:pStyle w:val="Heading4"/>
@@ -4713,7 +5852,7 @@
       <w:pPr>
         <w:numPr>
           <w:ilvl w:val="0"/>
-          <w:numId w:val="1005"/>
+          <w:numId w:val="1007"/>
         </w:numPr>
         <w:pStyle w:val="Compact"/>
       </w:pPr>
@@ -4768,7 +5907,7 @@
       <w:pPr>
         <w:numPr>
           <w:ilvl w:val="0"/>
-          <w:numId w:val="1005"/>
+          <w:numId w:val="1007"/>
         </w:numPr>
         <w:pStyle w:val="Compact"/>
       </w:pPr>
@@ -4780,7 +5919,7 @@
       <w:pPr>
         <w:numPr>
           <w:ilvl w:val="0"/>
-          <w:numId w:val="1005"/>
+          <w:numId w:val="1007"/>
         </w:numPr>
         <w:pStyle w:val="Compact"/>
       </w:pPr>
@@ -4792,7 +5931,7 @@
       <w:pPr>
         <w:numPr>
           <w:ilvl w:val="0"/>
-          <w:numId w:val="1005"/>
+          <w:numId w:val="1007"/>
         </w:numPr>
         <w:pStyle w:val="Compact"/>
       </w:pPr>
@@ -4825,10 +5964,10 @@
         </w:pict>
       </w:r>
     </w:p>
-    <w:bookmarkEnd w:id="60"/>
-    <w:bookmarkEnd w:id="61"/>
-    <w:bookmarkEnd w:id="62"/>
-    <w:bookmarkStart w:id="63" w:name="eu-quota-e8ads_v5-24-vcpu-sweden-central"/>
+    <w:bookmarkEnd w:id="65"/>
+    <w:bookmarkEnd w:id="66"/>
+    <w:bookmarkEnd w:id="67"/>
+    <w:bookmarkStart w:id="68" w:name="eu-quota-e8ads_v5-24-vcpu-sweden-central"/>
     <w:p>
       <w:pPr>
         <w:pStyle w:val="Heading2"/>
@@ -4929,7 +6068,7 @@
       <w:pPr>
         <w:numPr>
           <w:ilvl w:val="0"/>
-          <w:numId w:val="1006"/>
+          <w:numId w:val="1008"/>
         </w:numPr>
         <w:pStyle w:val="Compact"/>
       </w:pPr>
@@ -4960,7 +6099,7 @@
       <w:pPr>
         <w:numPr>
           <w:ilvl w:val="0"/>
-          <w:numId w:val="1006"/>
+          <w:numId w:val="1008"/>
         </w:numPr>
         <w:pStyle w:val="Compact"/>
       </w:pPr>
@@ -4994,8 +6133,8 @@
         </w:pict>
       </w:r>
     </w:p>
-    <w:bookmarkEnd w:id="63"/>
-    <w:bookmarkStart w:id="66" w:name="part-3-capacity-management"/>
+    <w:bookmarkEnd w:id="68"/>
+    <w:bookmarkStart w:id="71" w:name="part-3-capacity-management"/>
     <w:p>
       <w:pPr>
         <w:pStyle w:val="Heading2"/>
@@ -5004,7 +6143,7 @@
         <w:t xml:space="preserve">PART 3 — CAPACITY MANAGEMENT</w:t>
       </w:r>
     </w:p>
-    <w:bookmarkStart w:id="64" w:name="what-is-capacity-management"/>
+    <w:bookmarkStart w:id="69" w:name="what-is-capacity-management"/>
     <w:p>
       <w:pPr>
         <w:pStyle w:val="Heading3"/>
@@ -5037,8 +6176,8 @@
         <w:t xml:space="preserve">— the reserved desks. Quota allows you to have up to N desks; capacity management ensures you have exactly the right number of desks reserved at all times — not too few (team can’t sit), not too many (paying for empty desks). The engine re-checks this every 6 minutes.</w:t>
       </w:r>
     </w:p>
-    <w:bookmarkEnd w:id="64"/>
-    <w:bookmarkStart w:id="65" w:name="X57d01288c83f811f6c43c7bd21520096d008515"/>
+    <w:bookmarkEnd w:id="69"/>
+    <w:bookmarkStart w:id="70" w:name="X57d01288c83f811f6c43c7bd21520096d008515"/>
     <w:p>
       <w:pPr>
         <w:pStyle w:val="Heading3"/>
@@ -5283,9 +6422,9 @@
         </w:pict>
       </w:r>
     </w:p>
-    <w:bookmarkEnd w:id="65"/>
-    <w:bookmarkEnd w:id="66"/>
-    <w:bookmarkStart w:id="71" w:name="Xc185c0588f34309d167018f2e8434b551f6e383"/>
+    <w:bookmarkEnd w:id="70"/>
+    <w:bookmarkEnd w:id="71"/>
+    <w:bookmarkStart w:id="76" w:name="Xc185c0588f34309d167018f2e8434b551f6e383"/>
     <w:p>
       <w:pPr>
         <w:pStyle w:val="Heading2"/>
@@ -5331,7 +6470,7 @@
         <w:t xml:space="preserve">Configured Buffer:         40 vCPU  [deliberately empty desks for next hire]</w:t>
       </w:r>
     </w:p>
-    <w:bookmarkStart w:id="67" w:name="target-reserved-capacity"/>
+    <w:bookmarkStart w:id="72" w:name="target-reserved-capacity"/>
     <w:p>
       <w:pPr>
         <w:pStyle w:val="Heading3"/>
@@ -5369,8 +6508,8 @@
         <w:t xml:space="preserve">Reservation Deficit  = max(0, 200 - 200) = 0   [no deficit — perfectly balanced]</w:t>
       </w:r>
     </w:p>
-    <w:bookmarkEnd w:id="67"/>
-    <w:bookmarkStart w:id="68" w:name="X6ca16ea4b593ebd41980eb5568ebbd48ec6607c"/>
+    <w:bookmarkEnd w:id="72"/>
+    <w:bookmarkStart w:id="73" w:name="X6ca16ea4b593ebd41980eb5568ebbd48ec6607c"/>
     <w:p>
       <w:pPr>
         <w:pStyle w:val="Heading3"/>
@@ -5440,7 +6579,7 @@
       <w:pPr>
         <w:numPr>
           <w:ilvl w:val="0"/>
-          <w:numId w:val="1007"/>
+          <w:numId w:val="1009"/>
         </w:numPr>
         <w:pStyle w:val="Compact"/>
       </w:pPr>
@@ -5452,7 +6591,7 @@
       <w:pPr>
         <w:numPr>
           <w:ilvl w:val="0"/>
-          <w:numId w:val="1007"/>
+          <w:numId w:val="1009"/>
         </w:numPr>
         <w:pStyle w:val="Compact"/>
       </w:pPr>
@@ -5464,7 +6603,7 @@
       <w:pPr>
         <w:numPr>
           <w:ilvl w:val="0"/>
-          <w:numId w:val="1007"/>
+          <w:numId w:val="1009"/>
         </w:numPr>
         <w:pStyle w:val="Compact"/>
       </w:pPr>
@@ -5490,8 +6629,8 @@
         <w:t xml:space="preserve">HAPPY PATH — System self-heals within one reconciliation cycle. ✅</w:t>
       </w:r>
     </w:p>
-    <w:bookmarkEnd w:id="68"/>
-    <w:bookmarkStart w:id="70" w:name="Xe624e9ad9ec9e55115ece1a32e9b317b40b71cc"/>
+    <w:bookmarkEnd w:id="73"/>
+    <w:bookmarkStart w:id="75" w:name="Xe624e9ad9ec9e55115ece1a32e9b317b40b71cc"/>
     <w:p>
       <w:pPr>
         <w:pStyle w:val="Heading3"/>
@@ -5549,7 +6688,7 @@
         <w:t xml:space="preserve">Deficit:         48 vCPU — CANNOT be filled</w:t>
       </w:r>
     </w:p>
-    <w:bookmarkStart w:id="69" w:name="system-behaviour"/>
+    <w:bookmarkStart w:id="74" w:name="system-behaviour"/>
     <w:p>
       <w:pPr>
         <w:pStyle w:val="Heading4"/>
@@ -5562,7 +6701,7 @@
       <w:pPr>
         <w:numPr>
           <w:ilvl w:val="0"/>
-          <w:numId w:val="1008"/>
+          <w:numId w:val="1010"/>
         </w:numPr>
         <w:pStyle w:val="Compact"/>
       </w:pPr>
@@ -5574,7 +6713,7 @@
       <w:pPr>
         <w:numPr>
           <w:ilvl w:val="0"/>
-          <w:numId w:val="1008"/>
+          <w:numId w:val="1010"/>
         </w:numPr>
         <w:pStyle w:val="Compact"/>
       </w:pPr>
@@ -5598,7 +6737,7 @@
       <w:pPr>
         <w:numPr>
           <w:ilvl w:val="0"/>
-          <w:numId w:val="1008"/>
+          <w:numId w:val="1010"/>
         </w:numPr>
         <w:pStyle w:val="Compact"/>
       </w:pPr>
@@ -5619,7 +6758,7 @@
       <w:pPr>
         <w:numPr>
           <w:ilvl w:val="0"/>
-          <w:numId w:val="1008"/>
+          <w:numId w:val="1010"/>
         </w:numPr>
         <w:pStyle w:val="Compact"/>
       </w:pPr>
@@ -5631,7 +6770,7 @@
       <w:pPr>
         <w:numPr>
           <w:ilvl w:val="0"/>
-          <w:numId w:val="1008"/>
+          <w:numId w:val="1010"/>
         </w:numPr>
         <w:pStyle w:val="Compact"/>
       </w:pPr>
@@ -5686,10 +6825,10 @@
         </w:pict>
       </w:r>
     </w:p>
-    <w:bookmarkEnd w:id="69"/>
-    <w:bookmarkEnd w:id="70"/>
-    <w:bookmarkEnd w:id="71"/>
-    <w:bookmarkStart w:id="76" w:name="X82628b6e624abe8c37ba706b09873b1c44d54a3"/>
+    <w:bookmarkEnd w:id="74"/>
+    <w:bookmarkEnd w:id="75"/>
+    <w:bookmarkEnd w:id="76"/>
+    <w:bookmarkStart w:id="81" w:name="X82628b6e624abe8c37ba706b09873b1c44d54a3"/>
     <w:p>
       <w:pPr>
         <w:pStyle w:val="Heading2"/>
@@ -5706,7 +6845,7 @@
         <w:t xml:space="preserve">This is where the old fixed 30-40% DR reserve is replaced with a smarter calculation.</w:t>
       </w:r>
     </w:p>
-    <w:bookmarkStart w:id="72" w:name="X9079f76ef58f6c1f9613ec9bd34818c7c7a19ba"/>
+    <w:bookmarkStart w:id="77" w:name="X9079f76ef58f6c1f9613ec9bd34818c7c7a19ba"/>
     <w:p>
       <w:pPr>
         <w:pStyle w:val="Heading3"/>
@@ -5789,8 +6928,8 @@
         <w:t xml:space="preserve">Saving: 80 desks (40%) — freed for real work, paying nothing extra for protection</w:t>
       </w:r>
     </w:p>
-    <w:bookmarkEnd w:id="72"/>
-    <w:bookmarkStart w:id="73" w:name="worked-example-with-our-starter-values"/>
+    <w:bookmarkEnd w:id="77"/>
+    <w:bookmarkStart w:id="78" w:name="worked-example-with-our-starter-values"/>
     <w:p>
       <w:pPr>
         <w:pStyle w:val="Heading3"/>
@@ -5986,8 +7125,8 @@
         <w:t xml:space="preserve">for DR — acceptable because failures are mutually exclusive</w:t>
       </w:r>
     </w:p>
-    <w:bookmarkEnd w:id="73"/>
-    <w:bookmarkStart w:id="74" w:name="happy-path-dr-capacity-is-sufficient"/>
+    <w:bookmarkEnd w:id="78"/>
+    <w:bookmarkStart w:id="79" w:name="happy-path-dr-capacity-is-sufficient"/>
     <w:p>
       <w:pPr>
         <w:pStyle w:val="Heading3"/>
@@ -6043,8 +7182,8 @@
         <w:t xml:space="preserve">HAPPY PATH — DR standby is healthy. Alert threshold (OBS-002) not breached. ✅</w:t>
       </w:r>
     </w:p>
-    <w:bookmarkEnd w:id="74"/>
-    <w:bookmarkStart w:id="75" w:name="X34c95ca19c860a0a648d24fdf36a5dfe01c3552"/>
+    <w:bookmarkEnd w:id="79"/>
+    <w:bookmarkStart w:id="80" w:name="X34c95ca19c860a0a648d24fdf36a5dfe01c3552"/>
     <w:p>
       <w:pPr>
         <w:pStyle w:val="Heading3"/>
@@ -6184,9 +7323,9 @@
         </w:pict>
       </w:r>
     </w:p>
-    <w:bookmarkEnd w:id="75"/>
-    <w:bookmarkEnd w:id="76"/>
-    <w:bookmarkStart w:id="77" w:name="complete-summary-all-paths"/>
+    <w:bookmarkEnd w:id="80"/>
+    <w:bookmarkEnd w:id="81"/>
+    <w:bookmarkStart w:id="82" w:name="complete-summary-all-paths"/>
     <w:p>
       <w:pPr>
         <w:pStyle w:val="Heading2"/>
@@ -7087,8 +8226,8 @@
         </w:tc>
       </w:tr>
     </w:tbl>
-    <w:bookmarkEnd w:id="77"/>
-    <w:bookmarkEnd w:id="78"/>
+    <w:bookmarkEnd w:id="82"/>
+    <w:bookmarkEnd w:id="83"/>
     <w:sectPr/>
   </w:body>
 </w:document>
@@ -7363,6 +8502,9 @@
     <w:abstractNumId w:val="991"/>
   </w:num>
   <w:num w:numId="1002">
+    <w:abstractNumId w:val="991"/>
+  </w:num>
+  <w:num w:numId="1003">
     <w:abstractNumId w:val="99411"/>
     <w:lvlOverride w:ilvl="0">
       <w:startOverride w:val="1"/>
@@ -7391,9 +8533,6 @@
     <w:lvlOverride w:ilvl="8">
       <w:startOverride w:val="1"/>
     </w:lvlOverride>
-  </w:num>
-  <w:num w:numId="1003">
-    <w:abstractNumId w:val="991"/>
   </w:num>
   <w:num w:numId="1004">
     <w:abstractNumId w:val="99411"/>
@@ -7426,6 +8565,9 @@
     </w:lvlOverride>
   </w:num>
   <w:num w:numId="1005">
+    <w:abstractNumId w:val="991"/>
+  </w:num>
+  <w:num w:numId="1006">
     <w:abstractNumId w:val="99411"/>
     <w:lvlOverride w:ilvl="0">
       <w:startOverride w:val="1"/>
@@ -7454,9 +8596,6 @@
     <w:lvlOverride w:ilvl="8">
       <w:startOverride w:val="1"/>
     </w:lvlOverride>
-  </w:num>
-  <w:num w:numId="1006">
-    <w:abstractNumId w:val="991"/>
   </w:num>
   <w:num w:numId="1007">
     <w:abstractNumId w:val="99411"/>
@@ -7489,6 +8628,39 @@
     </w:lvlOverride>
   </w:num>
   <w:num w:numId="1008">
+    <w:abstractNumId w:val="991"/>
+  </w:num>
+  <w:num w:numId="1009">
+    <w:abstractNumId w:val="99411"/>
+    <w:lvlOverride w:ilvl="0">
+      <w:startOverride w:val="1"/>
+    </w:lvlOverride>
+    <w:lvlOverride w:ilvl="1">
+      <w:startOverride w:val="1"/>
+    </w:lvlOverride>
+    <w:lvlOverride w:ilvl="2">
+      <w:startOverride w:val="1"/>
+    </w:lvlOverride>
+    <w:lvlOverride w:ilvl="3">
+      <w:startOverride w:val="1"/>
+    </w:lvlOverride>
+    <w:lvlOverride w:ilvl="4">
+      <w:startOverride w:val="1"/>
+    </w:lvlOverride>
+    <w:lvlOverride w:ilvl="5">
+      <w:startOverride w:val="1"/>
+    </w:lvlOverride>
+    <w:lvlOverride w:ilvl="6">
+      <w:startOverride w:val="1"/>
+    </w:lvlOverride>
+    <w:lvlOverride w:ilvl="7">
+      <w:startOverride w:val="1"/>
+    </w:lvlOverride>
+    <w:lvlOverride w:ilvl="8">
+      <w:startOverride w:val="1"/>
+    </w:lvlOverride>
+  </w:num>
+  <w:num w:numId="1010">
     <w:abstractNumId w:val="99411"/>
     <w:lvlOverride w:ilvl="0">
       <w:startOverride w:val="1"/>

</xml_diff>